<commit_message>
Updated portfolio with premium UI and OSCC Metagenomics Blog
</commit_message>
<xml_diff>
--- a/Vandna_Gupta_CV_Generated.docx
+++ b/Vandna_Gupta_CV_Generated.docx
@@ -45,7 +45,7 @@
     </w:p>
     <w:p>
       <w:r>
-        <w:t>M.Sc. Bioinformatics candidate (Chaudhary Charan Singh University, 2024-2026) with active research internship at the National Institute of Cancer Prevention and Research (NICPR), Noida. Specializes in end-to-end metatranscriptomics pipeline development, functional biomarker profiling using KEGG database, NGS-based microbiome analysis, and multi-omics data interpretation in cancer research. Distinguished by advanced proficiency in next-generation AI research tools including Claude AI (Anthropic), NeodiSC, AntiGravity AI, OpenCode AI, and Gemini CLI, enabling accelerated hypothesis generation, literature synthesis, and bioinformatics workflow design at a level uncommon among early-career researchers. Certified in Advanced Microsoft Excel for data analysis and reporting.</w:t>
+        <w:t>M.Sc. Bioinformatics candidate (Chaudhary Charan Singh University, 2024-2026) with active research internship at the National Institute of Cancer Prevention and Research (ICMR-NICPR), Noida. Specializes in end-to-end metatranscriptomics pipeline development, functional biomarker profiling using KEGG database, NGS-based microbiome analysis, and multi-omics data interpretation in cancer research. Distinguished by advanced proficiency in next-generation AI research tools including Claude AI (Anthropic), NeodiSC, AntiGravity AI, OpenCode AI, and Gemini CLI, enabling accelerated hypothesis generation, literature synthesis, and bioinformatics workflow design at a level uncommon among early-career researchers. Certified in Advanced Microsoft Excel for data analysis and reporting.</w:t>
       </w:r>
     </w:p>
     <w:p>
@@ -289,7 +289,7 @@
         <w:rPr>
           <w:b/>
         </w:rPr>
-        <w:t>Bioinformatics Research Trainee  |  National Institute of Cancer Prevention &amp; Research (NICPR), Noida  |  2025 - Present</w:t>
+        <w:t>Bioinformatics Research Trainee  |  National Institute of Cancer Prevention &amp; Research (ICMR-NICPR), Noida  |  2025 - Present</w:t>
       </w:r>
     </w:p>
     <w:p>
@@ -557,7 +557,7 @@
         <w:pStyle w:val="ListBullet"/>
       </w:pPr>
       <w:r>
-        <w:t>Bioinformatics Research Internship - National Institute of Cancer Prevention &amp; Research (NICPR), Noida (2025-Present)</w:t>
+        <w:t>Bioinformatics Research Internship - National Institute of Cancer Prevention &amp; Research (ICMR-NICPR), Noida (2025-Present)</w:t>
       </w:r>
     </w:p>
     <w:p>

</xml_diff>